<commit_message>
Deploy simternship build 2026-09-15
</commit_message>
<xml_diff>
--- a/hub/files/PA2.docx
+++ b/hub/files/PA2.docx
@@ -171,20 +171,20 @@
               <w:rPr>
                 <w:sz w:val="19"/>
               </w:rPr>
-              <w:t xml:space="preserve">Canvas — one </w:t>
+              <w:t xml:space="preserve">Canvas — </w:t>
             </w:r>
             <w:r>
               <w:rPr>
                 <w:b/>
                 <w:sz w:val="19"/>
               </w:rPr>
-              <w:t>.docx</w:t>
+              <w:t>one .docx</w:t>
             </w:r>
             <w:r>
               <w:rPr>
                 <w:sz w:val="19"/>
               </w:rPr>
-              <w:t xml:space="preserve"> (memo, ≤ 6 pages) + the filled Source Audit Form from Appendix A</w:t>
+              <w:t>: memo + filled Source Audit Form (Appendix A) + prompts and transcript as an appendix. No PDF, no links, no second file (feedback returns as Word comments)</w:t>
             </w:r>
           </w:p>
         </w:tc>
@@ -208,43 +208,16 @@
         <w:t>Secondary Research</w:t>
       </w:r>
       <w:r>
-        <w:t xml:space="preserve"> (week 2) + the librarian guest visit Wednesday Sep 2 → Practice — Summit Point </w:t>
+        <w:t xml:space="preserve"> + the librarian visit → Practice — Summit Point </w:t>
       </w:r>
       <w:r>
         <w:rPr>
           <w:b/>
         </w:rPr>
-        <w:t>Round 3</w:t>
+        <w:t>Rounds 3–4</w:t>
       </w:r>
       <w:r>
-        <w:t xml:space="preserve"> (</w:t>
-      </w:r>
-      <w:r>
-        <w:rPr>
-          <w:i/>
-        </w:rPr>
-        <w:t>Neo RFP</w:t>
-      </w:r>
-      <w:r>
-        <w:t xml:space="preserve">) and </w:t>
-      </w:r>
-      <w:r>
-        <w:rPr>
-          <w:b/>
-        </w:rPr>
-        <w:t>Round 4</w:t>
-      </w:r>
-      <w:r>
-        <w:t xml:space="preserve"> (</w:t>
-      </w:r>
-      <w:r>
-        <w:rPr>
-          <w:i/>
-        </w:rPr>
-        <w:t>Analyze secondary research</w:t>
-      </w:r>
-      <w:r>
-        <w:t>) → Now the real thing: the desk-research memo that precedes the PA3 client interview. Professionals never walk into a client conversation cold.</w:t>
+        <w:t xml:space="preserve"> → Now the real thing: the desk-research memo before the PA3 founder interview.</w:t>
       </w:r>
     </w:p>
     <w:p>
@@ -257,7 +230,7 @@
     </w:p>
     <w:p>
       <w:r>
-        <w:t xml:space="preserve">Neo Smart Living is launching the </w:t>
+        <w:t xml:space="preserve">Neo Smart Living sells the </w:t>
       </w:r>
       <w:r>
         <w:rPr>
@@ -275,7 +248,7 @@
         <w:t>$23,000 installed</w:t>
       </w:r>
       <w:r>
-        <w:t>. Before anyone designs a survey or talks to the founder, your team builds the picture the public record already holds: what the category is, who competes, what substitutes, where $23K sits, and what California lets you put in a backyard. You do it the modern way (AI deep research), the traditional way (a licensed library report), and then run the source audit that decides which claims are safe to put in front of a client.</w:t>
+        <w:t>. Before the founder interview, your team assembles what the public record says: the category, competitors and substitutes, where $23K really sits, and what California allows in a backyard — by AI deep research, one licensed library report, and a source audit that decides which claims can go in front of a client.</w:t>
       </w:r>
     </w:p>
     <w:p>
@@ -298,19 +271,16 @@
         <w:rPr>
           <w:b/>
         </w:rPr>
-        <w:t>Run Part A — AI deep research.</w:t>
+        <w:t>Write your own question list and outline first</w:t>
       </w:r>
       <w:r>
-        <w:t xml:space="preserve"> Use a deep-research-capable tool with at least two scoped prompts (samples in Appendix B); keep full transcripts and links. Iterate — demand a citation for every claim, and treat every output as </w:t>
+        <w:t xml:space="preserve"> (they go in the AI reflection). Then Part A: at least two scoped prompts (Appendix B) in a deep-research tool; iterate until every claim carries a source; keep the transcript. </w:t>
       </w:r>
       <w:r>
         <w:rPr>
-          <w:i/>
+          <w:b/>
         </w:rPr>
-        <w:t>unverified draft</w:t>
-      </w:r>
-      <w:r>
-        <w:t xml:space="preserve"> until Part C.</w:t>
+        <w:t>Prompts and transcript go in an appendix, never in the memo body.</w:t>
       </w:r>
     </w:p>
     <w:p>
@@ -328,25 +298,16 @@
         <w:t>Write the memo</w:t>
       </w:r>
       <w:r>
-        <w:t xml:space="preserve"> (≤ 6 pages incl. tables): category definition &amp; size (studio pod vs. ADU vs. tiny home vs. shed — and why); a California regulatory snapshot (when a permit is required, what the under-120-sq-ft exemption actually exempts, why "no plumbing" matters); ≥ 4 direct competitors with advertised price </w:t>
-      </w:r>
-      <w:r>
-        <w:rPr>
-          <w:b/>
-        </w:rPr>
-        <w:t>and what it excludes</w:t>
-      </w:r>
-      <w:r>
-        <w:t xml:space="preserve">; substitutes with at least one price trap; customer evidence (vendor claims vs. independent); and where $23K sits among </w:t>
+        <w:t xml:space="preserve"> (≤ 6 pages) under the six headings in </w:t>
       </w:r>
       <w:r>
         <w:rPr>
           <w:i/>
         </w:rPr>
-        <w:t>completed costs</w:t>
+        <w:t>What to submit</w:t>
       </w:r>
       <w:r>
-        <w:t>, not headlines.</w:t>
+        <w:t>, citing every fact with source name and link. It is your synthesis in your words: no pasted AI output, no placeholders, no "draft" label.</w:t>
       </w:r>
     </w:p>
     <w:p>
@@ -361,19 +322,19 @@
         <w:rPr>
           <w:b/>
         </w:rPr>
-        <w:t>Do Part B — the library pass.</w:t>
+        <w:t>Part B, the library pass:</w:t>
       </w:r>
       <w:r>
-        <w:t xml:space="preserve"> Through the CPP Library database portal (not Google), retrieve one licensed industry report — Mintel, IBISWorld, or Statista; ask a librarian if unsure which fits. Extract </w:t>
+        <w:t xml:space="preserve"> through the CPP Library portal (not Google), retrieve one licensed report (Mintel, IBISWorld or Statista). Record three findings the AI pass lacked, </w:t>
       </w:r>
       <w:r>
         <w:rPr>
           <w:b/>
         </w:rPr>
-        <w:t>three findings that appeared nowhere in your AI pass</w:t>
+        <w:t>say what industry the report actually covers</w:t>
       </w:r>
       <w:r>
-        <w:t>.</w:t>
+        <w:t>, and write a half-page comparison: where the sources disagree, which you trust for what, and your search path.</w:t>
       </w:r>
     </w:p>
     <w:p>
@@ -388,19 +349,19 @@
         <w:rPr>
           <w:b/>
         </w:rPr>
-        <w:t>Write the AI-vs-library comparison</w:t>
+        <w:t>Part C, audit every number in the memo — the library numbers included — in the Appendix A form</w:t>
       </w:r>
       <w:r>
-        <w:t xml:space="preserve"> (half a page): what the licensed report had that the open web didn't, where the two </w:t>
+        <w:t xml:space="preserve"> (≥ 12 rows). </w:t>
       </w:r>
       <w:r>
         <w:rPr>
-          <w:i/>
+          <w:b/>
         </w:rPr>
-        <w:t>disagreed</w:t>
+        <w:t>Paste the URL and access date into every Source cell</w:t>
       </w:r>
       <w:r>
-        <w:t>, which you trust for what — plus one line on your search path (databases tried, librarian consulted).</w:t>
+        <w:t>; a row with no URL scores zero.</w:t>
       </w:r>
     </w:p>
     <w:p>
@@ -415,19 +376,10 @@
         <w:rPr>
           <w:b/>
         </w:rPr>
-        <w:t>Audit every number — Part C.</w:t>
+        <w:t>Push until something breaks:</w:t>
       </w:r>
       <w:r>
-        <w:t xml:space="preserve"> Fill the Source Audit Form (Appendix A) for ≥ 12 claims, including </w:t>
-      </w:r>
-      <w:r>
-        <w:rPr>
-          <w:b/>
-        </w:rPr>
-        <w:t>every number in the memo</w:t>
-      </w:r>
-      <w:r>
-        <w:t>: publisher type, date, who collected it and why, the method behind the number, corroboration, verdict, action taken.</w:t>
+        <w:t xml:space="preserve"> at least two rows rated Unverified or Contradicted, each with an action visible in the memo (claim cut, ranged, or labelled vendor-claimed). A clean audit is a failed audit.</w:t>
       </w:r>
     </w:p>
     <w:p>
@@ -442,19 +394,16 @@
         <w:rPr>
           <w:b/>
         </w:rPr>
-        <w:t>Push until something breaks.</w:t>
+        <w:t>Build the interview bridge:</w:t>
       </w:r>
       <w:r>
-        <w:t xml:space="preserve"> A clean audit is a failed audit: we expect </w:t>
+        <w:t xml:space="preserve"> five founder questions a web search cannot answer and three hypotheses, each naming its motivating section </w:t>
       </w:r>
       <w:r>
         <w:rPr>
           <w:b/>
         </w:rPr>
-        <w:t>≥ 2 rows rated Unverified or Contradicted</w:t>
-      </w:r>
-      <w:r>
-        <w:t>, each with a real action (claim cut, ranged, or downgraded to "vendor-claimed"). If everything verified cleanly, you didn't push hard enough.</w:t>
+        <w:t>and the method that tests it: founder interview, focus group or survey.</w:t>
       </w:r>
     </w:p>
     <w:p>
@@ -469,28 +418,10 @@
         <w:rPr>
           <w:b/>
         </w:rPr>
-        <w:t>Build the interview bridge.</w:t>
+        <w:t>Answer the four reflection prompts</w:t>
       </w:r>
       <w:r>
-        <w:t xml:space="preserve"> Close the memo with </w:t>
-      </w:r>
-      <w:r>
-        <w:rPr>
-          <w:b/>
-        </w:rPr>
-        <w:t>five founder questions secondary research cannot answer</w:t>
-      </w:r>
-      <w:r>
-        <w:t xml:space="preserve"> and </w:t>
-      </w:r>
-      <w:r>
-        <w:rPr>
-          <w:b/>
-        </w:rPr>
-        <w:t>three hypotheses</w:t>
-      </w:r>
-      <w:r>
-        <w:t xml:space="preserve"> for your primary research — each citing the section that motivated it. This is your PA3 interview prep.</w:t>
+        <w:t xml:space="preserve"> below, specifically.</w:t>
       </w:r>
     </w:p>
     <w:p>
@@ -512,7 +443,31 @@
         <w:t xml:space="preserve">☐  </w:t>
       </w:r>
       <w:r>
-        <w:t>Secondary research memo (≤ 6 pages): every factual claim cited (source name + link); every less-than-Verified number flagged in the text</w:t>
+        <w:rPr>
+          <w:b/>
+        </w:rPr>
+        <w:t>Memo (≤ 6 pages), six headings in this order:</w:t>
+      </w:r>
+      <w:r>
+        <w:t xml:space="preserve"> 1 Category definition &amp; size · 2 California regulatory snapshot (the 120-sq-ft exemption </w:t>
+      </w:r>
+      <w:r>
+        <w:rPr>
+          <w:b/>
+        </w:rPr>
+        <w:t>with</w:t>
+      </w:r>
+      <w:r>
+        <w:t xml:space="preserve"> its electrical caveat; why "no plumbing" matters) · 3 Direct competitors (≥ 4, advertised price </w:t>
+      </w:r>
+      <w:r>
+        <w:rPr>
+          <w:b/>
+        </w:rPr>
+        <w:t>and</w:t>
+      </w:r>
+      <w:r>
+        <w:t xml:space="preserve"> what it excludes) · 4 Substitutes &amp; price traps (≥ 1, with the category logic) · 5 Customer evidence (vendor vs independent) · 6 Where $23K sits among completed costs</w:t>
       </w:r>
     </w:p>
     <w:p>
@@ -526,7 +481,13 @@
         <w:t xml:space="preserve">☐  </w:t>
       </w:r>
       <w:r>
-        <w:t>Library block inside the memo: full report citation (database, title, publisher, date) + three findings + comparison paragraph + search path</w:t>
+        <w:rPr>
+          <w:b/>
+        </w:rPr>
+        <w:t>Library block</w:t>
+      </w:r>
+      <w:r>
+        <w:t xml:space="preserve"> inside the memo: full citation (database, title, publisher, date), report scope, three findings, comparison, search path</w:t>
       </w:r>
     </w:p>
     <w:p>
@@ -540,7 +501,13 @@
         <w:t xml:space="preserve">☐  </w:t>
       </w:r>
       <w:r>
-        <w:t>Filled Source Audit Form (Appendix A): ≥ 12 rows, ≥ 2 Unverified/Contradicted with actions</w:t>
+        <w:rPr>
+          <w:b/>
+        </w:rPr>
+        <w:t>Source Audit Form</w:t>
+      </w:r>
+      <w:r>
+        <w:t xml:space="preserve"> (Appendix A): ≥ 12 rows, a URL in every row, ≥ 2 Unverified/Contradicted with actions visible in the memo</w:t>
       </w:r>
     </w:p>
     <w:p>
@@ -554,7 +521,13 @@
         <w:t xml:space="preserve">☐  </w:t>
       </w:r>
       <w:r>
-        <w:t>Interview bridge: 5 founder questions + 3 hypotheses, each traced to its section</w:t>
+        <w:rPr>
+          <w:b/>
+        </w:rPr>
+        <w:t>Interview bridge:</w:t>
+      </w:r>
+      <w:r>
+        <w:t xml:space="preserve"> 5 questions + 3 hypotheses, each with its section and its method</w:t>
       </w:r>
     </w:p>
     <w:p>
@@ -568,7 +541,33 @@
         <w:t xml:space="preserve">☐  </w:t>
       </w:r>
       <w:r>
-        <w:t>AI reflection (below), with tools, actual prompts, and transcript links</w:t>
+        <w:rPr>
+          <w:b/>
+        </w:rPr>
+        <w:t>AI reflection:</w:t>
+      </w:r>
+      <w:r>
+        <w:t xml:space="preserve"> question list, outline, tools, prompts (a)–(d) each answered — a blank one scores 0 on that row</w:t>
+      </w:r>
+    </w:p>
+    <w:p>
+      <w:pPr>
+        <w:ind w:left="360"/>
+      </w:pPr>
+      <w:r>
+        <w:rPr>
+          <w:b/>
+        </w:rPr>
+        <w:t xml:space="preserve">☐  </w:t>
+      </w:r>
+      <w:r>
+        <w:rPr>
+          <w:b/>
+        </w:rPr>
+        <w:t>Appendix:</w:t>
+      </w:r>
+      <w:r>
+        <w:t xml:space="preserve"> actual prompts and full transcript, pasted, not linked</w:t>
       </w:r>
     </w:p>
     <w:p>
@@ -703,7 +702,7 @@
               <w:rPr>
                 <w:sz w:val="19"/>
               </w:rPr>
-              <w:t xml:space="preserve">Category line drawn correctly (studio pod ≠ ADU ≠ tiny home ≠ shed, with the plumbing/permit/foundation logic); the 120-sq-ft exemption stated </w:t>
+              <w:t xml:space="preserve">Category line drawn correctly (studio pod ≠ ADU ≠ tiny home ≠ shed, with the plumbing/permit/foundation logic); the 120-sq-ft exemption </w:t>
             </w:r>
             <w:r>
               <w:rPr>
@@ -772,7 +771,7 @@
               <w:rPr>
                 <w:sz w:val="19"/>
               </w:rPr>
-              <w:t>≥ 4 competitors with advertised prices and stated exclusions; ≥ 1 price trap correctly placed in substitutes with the category logic; five founder questions a web search demonstrably cannot answer</w:t>
+              <w:t>≥ 4 competitors with advertised prices and stated exclusions; ≥ 1 price trap correctly placed in substitutes with the category logic; five founder questions a web search cannot answer; hypotheses routed to a method</w:t>
             </w:r>
           </w:p>
         </w:tc>
@@ -828,7 +827,7 @@
               <w:rPr>
                 <w:sz w:val="19"/>
               </w:rPr>
-              <w:t>Every memo number has a row; verdicts justified by the who/why/when/how columns, not decorative; ≥ 2 Unverified/Contradicted rows with actions visible in the memo — a clean audit is a failed audit</w:t>
+              <w:t>Every memo number has a row with a URL; verdicts justified by the who/why/when/how columns, not decorative; ≥ 2 Unverified/Contradicted rows with actions visible in the memo</w:t>
             </w:r>
           </w:p>
         </w:tc>
@@ -884,7 +883,7 @@
               <w:rPr>
                 <w:sz w:val="19"/>
               </w:rPr>
-              <w:t>Licensed report properly cited; 3 findings genuinely absent from the AI pass; comparison names a disagreement or capability difference, not "both were useful"</w:t>
+              <w:t>Licensed report properly cited, scope stated; 3 findings genuinely absent from the AI pass; comparison names a disagreement or capability difference, not "both were useful"</w:t>
             </w:r>
           </w:p>
         </w:tc>
@@ -940,7 +939,7 @@
               <w:rPr>
                 <w:sz w:val="19"/>
               </w:rPr>
-              <w:t>Human-first question list and outline documented; the four reflection prompts answered specifically, not generically</w:t>
+              <w:t>Human-first question list and outline documented; the four reflection prompts answered specifically, not generically; the memo is your synthesis, not the transcript</w:t>
             </w:r>
           </w:p>
         </w:tc>
@@ -972,7 +971,7 @@
         <w:t>is</w:t>
       </w:r>
       <w:r>
-        <w:t xml:space="preserve"> the assignment — so your human-first artifact is your own question list and section outline, written BEFORE you run any deep research. That order is the point: it is the only way to see what AI actually adds — or quietly subtracts. Then run and iterate your prompts, and answer the four prompts below (2–4 sentences each, specific to THIS assignment):</w:t>
+        <w:t xml:space="preserve"> the assignment — so your human-first artifact is your own question list and section outline, written BEFORE any deep research. That order is the point: it is the only way to see what AI actually adds — or quietly subtracts. Then run and iterate your prompts, and answer the four prompts below (2–4 sentences each, specific to THIS assignment):</w:t>
       </w:r>
     </w:p>
     <w:p>
@@ -1073,234 +1072,12 @@
         </w:sectPr>
       </w:pPr>
     </w:p>
-    <w:tbl>
-      <w:tblPr>
-        <w:tblStyle w:val="TableGrid"/>
-        <w:tblW w:type="auto" w:w="0"/>
-        <w:tblLook w:firstColumn="1" w:firstRow="1" w:lastColumn="0" w:lastRow="0" w:noHBand="0" w:noVBand="1" w:val="04A0"/>
-      </w:tblPr>
-      <w:tblGrid>
-        <w:gridCol w:w="1411"/>
-        <w:gridCol w:w="1411"/>
-        <w:gridCol w:w="1411"/>
-        <w:gridCol w:w="1411"/>
-        <w:gridCol w:w="1411"/>
-        <w:gridCol w:w="1411"/>
-        <w:gridCol w:w="1411"/>
-        <w:gridCol w:w="1411"/>
-        <w:gridCol w:w="1411"/>
-        <w:gridCol w:w="1411"/>
-      </w:tblGrid>
-      <w:tr>
-        <w:tc>
-          <w:tcPr>
-            <w:tcW w:type="dxa" w:w="1411"/>
-          </w:tcPr>
-          <w:p>
-            <w:r>
-              <w:rPr>
-                <w:b/>
-                <w:sz w:val="18"/>
-              </w:rPr>
-            </w:r>
-            <w:r>
-              <w:rPr>
-                <w:b/>
-                <w:sz w:val="18"/>
-              </w:rPr>
-              <w:t>#</w:t>
-            </w:r>
-          </w:p>
-        </w:tc>
-        <w:tc>
-          <w:tcPr>
-            <w:tcW w:type="dxa" w:w="1411"/>
-          </w:tcPr>
-          <w:p>
-            <w:r>
-              <w:rPr>
-                <w:b/>
-                <w:sz w:val="18"/>
-              </w:rPr>
-            </w:r>
-            <w:r>
-              <w:rPr>
-                <w:b/>
-                <w:sz w:val="18"/>
-              </w:rPr>
-              <w:t>Claim (as used in memo)</w:t>
-            </w:r>
-          </w:p>
-        </w:tc>
-        <w:tc>
-          <w:tcPr>
-            <w:tcW w:type="dxa" w:w="1411"/>
-          </w:tcPr>
-          <w:p>
-            <w:r>
-              <w:rPr>
-                <w:b/>
-                <w:sz w:val="18"/>
-              </w:rPr>
-            </w:r>
-            <w:r>
-              <w:rPr>
-                <w:b/>
-                <w:sz w:val="18"/>
-              </w:rPr>
-              <w:t>Source (name + URL)</w:t>
-            </w:r>
-          </w:p>
-        </w:tc>
-        <w:tc>
-          <w:tcPr>
-            <w:tcW w:type="dxa" w:w="1411"/>
-          </w:tcPr>
-          <w:p>
-            <w:r>
-              <w:rPr>
-                <w:b/>
-                <w:sz w:val="18"/>
-              </w:rPr>
-            </w:r>
-            <w:r>
-              <w:rPr>
-                <w:b/>
-                <w:sz w:val="18"/>
-              </w:rPr>
-              <w:t>Publisher type (gov / trade assoc. / research firm / vendor / news / blog)</w:t>
-            </w:r>
-          </w:p>
-        </w:tc>
-        <w:tc>
-          <w:tcPr>
-            <w:tcW w:type="dxa" w:w="1411"/>
-          </w:tcPr>
-          <w:p>
-            <w:r>
-              <w:rPr>
-                <w:b/>
-                <w:sz w:val="18"/>
-              </w:rPr>
-            </w:r>
-            <w:r>
-              <w:rPr>
-                <w:b/>
-                <w:sz w:val="18"/>
-              </w:rPr>
-              <w:t>Date</w:t>
-            </w:r>
-          </w:p>
-        </w:tc>
-        <w:tc>
-          <w:tcPr>
-            <w:tcW w:type="dxa" w:w="1411"/>
-          </w:tcPr>
-          <w:p>
-            <w:r>
-              <w:rPr>
-                <w:b/>
-                <w:sz w:val="18"/>
-              </w:rPr>
-            </w:r>
-            <w:r>
-              <w:rPr>
-                <w:b/>
-                <w:sz w:val="18"/>
-              </w:rPr>
-              <w:t>Who collected it &amp; why (their incentive)</w:t>
-            </w:r>
-          </w:p>
-        </w:tc>
-        <w:tc>
-          <w:tcPr>
-            <w:tcW w:type="dxa" w:w="1411"/>
-          </w:tcPr>
-          <w:p>
-            <w:r>
-              <w:rPr>
-                <w:b/>
-                <w:sz w:val="18"/>
-              </w:rPr>
-            </w:r>
-            <w:r>
-              <w:rPr>
-                <w:b/>
-                <w:sz w:val="18"/>
-              </w:rPr>
-              <w:t>Method behind the number</w:t>
-            </w:r>
-          </w:p>
-        </w:tc>
-        <w:tc>
-          <w:tcPr>
-            <w:tcW w:type="dxa" w:w="1411"/>
-          </w:tcPr>
-          <w:p>
-            <w:r>
-              <w:rPr>
-                <w:b/>
-                <w:sz w:val="18"/>
-              </w:rPr>
-            </w:r>
-            <w:r>
-              <w:rPr>
-                <w:b/>
-                <w:sz w:val="18"/>
-              </w:rPr>
-              <w:t>Corroborating source (or "none found")</w:t>
-            </w:r>
-          </w:p>
-        </w:tc>
-        <w:tc>
-          <w:tcPr>
-            <w:tcW w:type="dxa" w:w="1411"/>
-          </w:tcPr>
-          <w:p>
-            <w:r>
-              <w:rPr>
-                <w:b/>
-                <w:sz w:val="18"/>
-              </w:rPr>
-            </w:r>
-            <w:r>
-              <w:rPr>
-                <w:b/>
-                <w:sz w:val="18"/>
-              </w:rPr>
-              <w:t>Verdict</w:t>
-            </w:r>
-          </w:p>
-        </w:tc>
-        <w:tc>
-          <w:tcPr>
-            <w:tcW w:type="dxa" w:w="1411"/>
-          </w:tcPr>
-          <w:p>
-            <w:r>
-              <w:rPr>
-                <w:b/>
-                <w:sz w:val="18"/>
-              </w:rPr>
-            </w:r>
-            <w:r>
-              <w:rPr>
-                <w:b/>
-                <w:sz w:val="18"/>
-              </w:rPr>
-              <w:t>Action taken in memo</w:t>
-            </w:r>
-          </w:p>
-        </w:tc>
-      </w:tr>
-    </w:tbl>
-    <w:p/>
     <w:p>
       <w:r>
         <w:rPr>
           <w:b/>
         </w:rPr>
-        <w:t>Worked row — audit your claims to this standard:</w:t>
+        <w:t>Example row E1 — study it, do not copy it into your form:</w:t>
       </w:r>
     </w:p>
     <w:tbl>
@@ -1749,6 +1526,241 @@
     </w:tbl>
     <w:p/>
     <w:p>
+      <w:r>
+        <w:t>The lesson in E1: advertised price ≠ completed cost — always ask what the headline excludes, and compare only inside the category.</w:t>
+      </w:r>
+    </w:p>
+    <w:p>
+      <w:r>
+        <w:rPr>
+          <w:b/>
+        </w:rPr>
+        <w:t>Your form (fill every cell; add rows as needed):</w:t>
+      </w:r>
+    </w:p>
+    <w:tbl>
+      <w:tblPr>
+        <w:tblStyle w:val="TableGrid"/>
+        <w:tblW w:type="auto" w:w="0"/>
+        <w:tblLook w:firstColumn="1" w:firstRow="1" w:lastColumn="0" w:lastRow="0" w:noHBand="0" w:noVBand="1" w:val="04A0"/>
+      </w:tblPr>
+      <w:tblGrid>
+        <w:gridCol w:w="1411"/>
+        <w:gridCol w:w="1411"/>
+        <w:gridCol w:w="1411"/>
+        <w:gridCol w:w="1411"/>
+        <w:gridCol w:w="1411"/>
+        <w:gridCol w:w="1411"/>
+        <w:gridCol w:w="1411"/>
+        <w:gridCol w:w="1411"/>
+        <w:gridCol w:w="1411"/>
+        <w:gridCol w:w="1411"/>
+      </w:tblGrid>
+      <w:tr>
+        <w:tc>
+          <w:tcPr>
+            <w:tcW w:type="dxa" w:w="1411"/>
+          </w:tcPr>
+          <w:p>
+            <w:r>
+              <w:rPr>
+                <w:b/>
+                <w:sz w:val="18"/>
+              </w:rPr>
+            </w:r>
+            <w:r>
+              <w:rPr>
+                <w:b/>
+                <w:sz w:val="18"/>
+              </w:rPr>
+              <w:t>#</w:t>
+            </w:r>
+          </w:p>
+        </w:tc>
+        <w:tc>
+          <w:tcPr>
+            <w:tcW w:type="dxa" w:w="1411"/>
+          </w:tcPr>
+          <w:p>
+            <w:r>
+              <w:rPr>
+                <w:b/>
+                <w:sz w:val="18"/>
+              </w:rPr>
+            </w:r>
+            <w:r>
+              <w:rPr>
+                <w:b/>
+                <w:sz w:val="18"/>
+              </w:rPr>
+              <w:t>Claim (as used in memo)</w:t>
+            </w:r>
+          </w:p>
+        </w:tc>
+        <w:tc>
+          <w:tcPr>
+            <w:tcW w:type="dxa" w:w="1411"/>
+          </w:tcPr>
+          <w:p>
+            <w:r>
+              <w:rPr>
+                <w:b/>
+                <w:sz w:val="18"/>
+              </w:rPr>
+            </w:r>
+            <w:r>
+              <w:rPr>
+                <w:b/>
+                <w:sz w:val="18"/>
+              </w:rPr>
+              <w:t>Source (name + URL)</w:t>
+            </w:r>
+          </w:p>
+        </w:tc>
+        <w:tc>
+          <w:tcPr>
+            <w:tcW w:type="dxa" w:w="1411"/>
+          </w:tcPr>
+          <w:p>
+            <w:r>
+              <w:rPr>
+                <w:b/>
+                <w:sz w:val="18"/>
+              </w:rPr>
+            </w:r>
+            <w:r>
+              <w:rPr>
+                <w:b/>
+                <w:sz w:val="18"/>
+              </w:rPr>
+              <w:t>Publisher type (gov / trade assoc. / research firm / vendor / news / blog)</w:t>
+            </w:r>
+          </w:p>
+        </w:tc>
+        <w:tc>
+          <w:tcPr>
+            <w:tcW w:type="dxa" w:w="1411"/>
+          </w:tcPr>
+          <w:p>
+            <w:r>
+              <w:rPr>
+                <w:b/>
+                <w:sz w:val="18"/>
+              </w:rPr>
+            </w:r>
+            <w:r>
+              <w:rPr>
+                <w:b/>
+                <w:sz w:val="18"/>
+              </w:rPr>
+              <w:t>Date</w:t>
+            </w:r>
+          </w:p>
+        </w:tc>
+        <w:tc>
+          <w:tcPr>
+            <w:tcW w:type="dxa" w:w="1411"/>
+          </w:tcPr>
+          <w:p>
+            <w:r>
+              <w:rPr>
+                <w:b/>
+                <w:sz w:val="18"/>
+              </w:rPr>
+            </w:r>
+            <w:r>
+              <w:rPr>
+                <w:b/>
+                <w:sz w:val="18"/>
+              </w:rPr>
+              <w:t>Who collected it &amp; why (their incentive)</w:t>
+            </w:r>
+          </w:p>
+        </w:tc>
+        <w:tc>
+          <w:tcPr>
+            <w:tcW w:type="dxa" w:w="1411"/>
+          </w:tcPr>
+          <w:p>
+            <w:r>
+              <w:rPr>
+                <w:b/>
+                <w:sz w:val="18"/>
+              </w:rPr>
+            </w:r>
+            <w:r>
+              <w:rPr>
+                <w:b/>
+                <w:sz w:val="18"/>
+              </w:rPr>
+              <w:t>Method behind the number</w:t>
+            </w:r>
+          </w:p>
+        </w:tc>
+        <w:tc>
+          <w:tcPr>
+            <w:tcW w:type="dxa" w:w="1411"/>
+          </w:tcPr>
+          <w:p>
+            <w:r>
+              <w:rPr>
+                <w:b/>
+                <w:sz w:val="18"/>
+              </w:rPr>
+            </w:r>
+            <w:r>
+              <w:rPr>
+                <w:b/>
+                <w:sz w:val="18"/>
+              </w:rPr>
+              <w:t>Corroborating source (or "none found")</w:t>
+            </w:r>
+          </w:p>
+        </w:tc>
+        <w:tc>
+          <w:tcPr>
+            <w:tcW w:type="dxa" w:w="1411"/>
+          </w:tcPr>
+          <w:p>
+            <w:r>
+              <w:rPr>
+                <w:b/>
+                <w:sz w:val="18"/>
+              </w:rPr>
+            </w:r>
+            <w:r>
+              <w:rPr>
+                <w:b/>
+                <w:sz w:val="18"/>
+              </w:rPr>
+              <w:t>Verdict</w:t>
+            </w:r>
+          </w:p>
+        </w:tc>
+        <w:tc>
+          <w:tcPr>
+            <w:tcW w:type="dxa" w:w="1411"/>
+          </w:tcPr>
+          <w:p>
+            <w:r>
+              <w:rPr>
+                <w:b/>
+                <w:sz w:val="18"/>
+              </w:rPr>
+            </w:r>
+            <w:r>
+              <w:rPr>
+                <w:b/>
+                <w:sz w:val="18"/>
+              </w:rPr>
+              <w:t>Action taken in memo</w:t>
+            </w:r>
+          </w:p>
+        </w:tc>
+      </w:tr>
+    </w:tbl>
+    <w:p/>
+    <w:p>
       <w:pPr>
         <w:sectPr>
           <w:pgSz w:w="15840" w:h="12240" w:orient="landscape"/>
@@ -1757,11 +1769,6 @@
           <w:docGrid w:linePitch="360"/>
         </w:sectPr>
       </w:pPr>
-    </w:p>
-    <w:p>
-      <w:r>
-        <w:t>The lesson in E1: advertised price ≠ completed cost — always ask what the headline excludes, and compare only inside the category.</w:t>
-      </w:r>
     </w:p>
     <w:p>
       <w:pPr>
@@ -1868,6 +1875,26 @@
           <w:sz w:val="19"/>
         </w:rPr>
         <w:t xml:space="preserve"> products that look price-comparable but are a different category (expandable container homes, foldable ADUs, travel trailers). Cite the specific product page or article for every price, with the date you accessed it. Where prices conflict between sources, show both and note the conflict.</w:t>
+      </w:r>
+    </w:p>
+    <w:p>
+      <w:r>
+        <w:rPr>
+          <w:b/>
+        </w:rPr>
+        <w:t>Prompt 3 — the citation pass (run it after 1 and 2):</w:t>
+      </w:r>
+    </w:p>
+    <w:p>
+      <w:pPr>
+        <w:ind w:left="432"/>
+      </w:pPr>
+      <w:r>
+        <w:rPr>
+          <w:i/>
+          <w:sz w:val="19"/>
+        </w:rPr>
+        <w:t>Restate every price and every market figure above as a claim with the source name, the exact URL and the date you accessed it. Say whether each price is a base, DIY, installed or turnkey figure and what it excludes. Remove any completed cost you estimated yourself. Where two pages disagree, show both.</w:t>
       </w:r>
     </w:p>
     <w:p>

</xml_diff>